<commit_message>
Drop the closing sections of the IV examples handout
Unnumber the section headings, rename the opening section to Instrumental
Variables and Natural Experiments, and cut "Where the line is drawn" and
"Teaching heuristic" so the handout ends with the Group B table and the
references. Four pages instead of five.

Co-Authored-By: Claude Opus 5 <noreply@anthropic.com>
</commit_message>
<xml_diff>
--- a/handouts/instrumental_variable_examples.docx
+++ b/handouts/instrumental_variable_examples.docx
@@ -31,7 +31,7 @@
         <w:spacing w:after="120" w:before="280"/>
       </w:pPr>
       <w:r>
-        <w:t xml:space="preserve">1. The distinction</w:t>
+        <w:t xml:space="preserve">Instrumental Variables and Natural Experiments</w:t>
       </w:r>
     </w:p>
     <w:p>
@@ -79,7 +79,7 @@
         <w:spacing w:after="120" w:before="280"/>
       </w:pPr>
       <w:r>
-        <w:t xml:space="preserve">2. Group A: instruments that come from a natural experiment</w:t>
+        <w:t xml:space="preserve">Group A: instruments that come from a natural experiment</w:t>
       </w:r>
     </w:p>
     <w:p>
@@ -1358,7 +1358,7 @@
         <w:spacing w:after="120" w:before="280"/>
       </w:pPr>
       <w:r>
-        <w:t xml:space="preserve">3. Group B: plausibly exogenous instruments without a natural experiment</w:t>
+        <w:t xml:space="preserve">Group B: plausibly exogenous instruments without a natural experiment</w:t>
       </w:r>
     </w:p>
     <w:p>
@@ -2822,134 +2822,6 @@
         </w:tc>
       </w:tr>
     </w:tbl>
-    <w:p>
-      <w:pPr>
-        <w:pStyle w:val="Heading1"/>
-        <w:spacing w:after="120" w:before="280"/>
-      </w:pPr>
-      <w:r>
-        <w:t xml:space="preserve">4. Where the line is drawn</w:t>
-      </w:r>
-    </w:p>
-    <w:p>
-      <w:pPr>
-        <w:spacing w:after="120"/>
-      </w:pPr>
-      <w:r>
-        <w:rPr>
-          <w:rFonts w:ascii="Calibri" w:cs="Calibri" w:eastAsia="Calibri" w:hAnsi="Calibri"/>
-          <w:sz w:val="22"/>
-          <w:szCs w:val="22"/>
-        </w:rPr>
-        <w:t xml:space="preserve">There is no sharp consensus, but three distinctions come up repeatedly.</w:t>
-      </w:r>
-    </w:p>
-    <w:p>
-      <w:pPr>
-        <w:pStyle w:val="ListParagraph"/>
-        <w:numPr>
-          <w:ilvl w:val="0"/>
-          <w:numId w:val="2"/>
-        </w:numPr>
-        <w:spacing w:after="80"/>
-      </w:pPr>
-      <w:r>
-        <w:rPr>
-          <w:rFonts w:ascii="Calibri" w:cs="Calibri" w:eastAsia="Calibri" w:hAnsi="Calibri"/>
-          <w:b/>
-          <w:bCs/>
-          <w:sz w:val="22"/>
-          <w:szCs w:val="22"/>
-        </w:rPr>
-        <w:t xml:space="preserve">RCT versus natural experiment. </w:t>
-      </w:r>
-      <w:r>
-        <w:rPr>
-          <w:rFonts w:ascii="Calibri" w:cs="Calibri" w:eastAsia="Calibri" w:hAnsi="Calibri"/>
-          <w:sz w:val="22"/>
-          <w:szCs w:val="22"/>
-        </w:rPr>
-        <w:t xml:space="preserve">The difference is who controlled the randomization. The Oregon lottery was run by the state, not by researchers, so it is a natural experiment even though it behaves like an RCT. Some authors call this a randomized natural experiment.</w:t>
-      </w:r>
-    </w:p>
-    <w:p>
-      <w:pPr>
-        <w:pStyle w:val="ListParagraph"/>
-        <w:numPr>
-          <w:ilvl w:val="0"/>
-          <w:numId w:val="2"/>
-        </w:numPr>
-        <w:spacing w:after="80"/>
-      </w:pPr>
-      <w:r>
-        <w:rPr>
-          <w:rFonts w:ascii="Calibri" w:cs="Calibri" w:eastAsia="Calibri" w:hAnsi="Calibri"/>
-          <w:b/>
-          <w:bCs/>
-          <w:sz w:val="22"/>
-          <w:szCs w:val="22"/>
-        </w:rPr>
-        <w:t xml:space="preserve">Natural experiment versus quasi-experiment. </w:t>
-      </w:r>
-      <w:r>
-        <w:rPr>
-          <w:rFonts w:ascii="Calibri" w:cs="Calibri" w:eastAsia="Calibri" w:hAnsi="Calibri"/>
-          <w:sz w:val="22"/>
-          <w:szCs w:val="22"/>
-        </w:rPr>
-        <w:t xml:space="preserve">This is the fuzziest boundary. Difference-in-differences, regression discontinuity, and synthetic control are usually called quasi-experimental. A workable rule: a natural experiment makes a claim about as-if random assignment; a quasi-experiment makes a claim about comparability of trends or of units near a cutoff (parallel trends, continuity).</w:t>
-      </w:r>
-    </w:p>
-    <w:p>
-      <w:pPr>
-        <w:pStyle w:val="ListParagraph"/>
-        <w:numPr>
-          <w:ilvl w:val="0"/>
-          <w:numId w:val="2"/>
-        </w:numPr>
-        <w:spacing w:after="80"/>
-      </w:pPr>
-      <w:r>
-        <w:rPr>
-          <w:rFonts w:ascii="Calibri" w:cs="Calibri" w:eastAsia="Calibri" w:hAnsi="Calibri"/>
-          <w:b/>
-          <w:bCs/>
-          <w:sz w:val="22"/>
-          <w:szCs w:val="22"/>
-        </w:rPr>
-        <w:t xml:space="preserve">Natural experiment versus IV. </w:t>
-      </w:r>
-      <w:r>
-        <w:rPr>
-          <w:rFonts w:ascii="Calibri" w:cs="Calibri" w:eastAsia="Calibri" w:hAnsi="Calibri"/>
-          <w:sz w:val="22"/>
-          <w:szCs w:val="22"/>
-        </w:rPr>
-        <w:t xml:space="preserve">IV is an estimator; the natural experiment is a design. A strong instrument is almost always one with an identifiable natural experiment behind it. The Group B instruments can still be valid, but their validity rests on an argument rather than on a mechanism.</w:t>
-      </w:r>
-    </w:p>
-    <w:p>
-      <w:pPr>
-        <w:pStyle w:val="Heading1"/>
-        <w:spacing w:after="120" w:before="280"/>
-      </w:pPr>
-      <w:r>
-        <w:t xml:space="preserve">5. Teaching heuristic</w:t>
-      </w:r>
-    </w:p>
-    <w:p>
-      <w:pPr>
-        <w:spacing w:after="120"/>
-      </w:pPr>
-      <w:r>
-        <w:rPr>
-          <w:rFonts w:ascii="Calibri" w:cs="Calibri" w:eastAsia="Calibri" w:hAnsi="Calibri"/>
-          <w:sz w:val="22"/>
-          <w:szCs w:val="22"/>
-        </w:rPr>
-        <w:t xml:space="preserve">Strength tracks how the variation is generated. Lotteries and random assignment (rows 1 to 4) are strong because a device did the assigning. Geographic proximity and historical conditions (rows 6 to 8) have decent first stages but leaky exclusion restrictions. Calendar, weather, and behavioral-timing instruments (rows 5, 9, 10) are often weak because the shift in treatment is small or the assigner is not external. A useful exercise is to have students identify the assigner for each instrument before looking at the strength rating, then compare.</w:t>
-      </w:r>
-    </w:p>
     <w:p>
       <w:pPr>
         <w:pStyle w:val="Heading1"/>

</xml_diff>

<commit_message>
Space out the rows in the IV examples tables
Each row is a self-contained example, but with no padding the entries ran
together and a multi-line cell read as part of the row above it. Add top and
bottom cell margins to both tables in the source, and render the PDF with
matching row height so the two views agree. Still four pages.

Co-Authored-By: Claude Opus 5 <noreply@anthropic.com>
</commit_message>
<xml_diff>
--- a/handouts/instrumental_variable_examples.docx
+++ b/handouts/instrumental_variable_examples.docx
@@ -106,6 +106,12 @@
           <w:insideH w:val="single" w:color="auto" w:sz="4"/>
           <w:insideV w:val="single" w:color="auto" w:sz="4"/>
         </w:tblBorders>
+        <w:tblCellMar>
+          <w:top w:type="dxa" w:w="100"/>
+          <w:left w:type="dxa" w:w="108"/>
+          <w:bottom w:type="dxa" w:w="100"/>
+          <w:right w:type="dxa" w:w="108"/>
+        </w:tblCellMar>
       </w:tblPr>
       <w:tblGrid>
         <w:gridCol w:w="400"/>
@@ -1385,6 +1391,12 @@
           <w:insideH w:val="single" w:color="auto" w:sz="4"/>
           <w:insideV w:val="single" w:color="auto" w:sz="4"/>
         </w:tblBorders>
+        <w:tblCellMar>
+          <w:top w:type="dxa" w:w="100"/>
+          <w:left w:type="dxa" w:w="108"/>
+          <w:bottom w:type="dxa" w:w="100"/>
+          <w:right w:type="dxa" w:w="108"/>
+        </w:tblCellMar>
       </w:tblPr>
       <w:tblGrid>
         <w:gridCol w:w="400"/>

</xml_diff>